<commit_message>
Teambeslissing: Cardiff Wound Impact Schedule niet verder uitgewerkt
- eCRF 47 (Ulcus-vervolgformulier) herleid tot uitsluitend genezingsstatus-tracking
  (sectie 3 "Cardiff Wound Impact Schedule" verwijderd); dekt nog steeds de
  COS-eindpunten "wound healing" en "time to healing"
- Protocol §5.5.6: de zin over het afnemen van de Cardiff Wound Impact Schedule op
  4/12 weken verwijderd, vervangen door een verwijzing naar de genezingsstatus-
  tracking via eCRF-document 47
- protocol-analyse.html: Cardiff-vermelding uit de rij voor eCRF 47 verwijderd
- Auditrapport bijgewerkt: Cardiff-gerelateerde TO DO-punten (instrument zelf +
  ICF-vermelding) vervallen; geboorteland bevestigd als definitieve keuze maar
  gemarkeerd als niet dringend (enkel te motiveren bij eventuele publicatie)
</commit_message>
<xml_diff>
--- a/(e)CRF/COS-CDS_Auditrapport_en_TODO.docx
+++ b/(e)CRF/COS-CDS_Auditrapport_en_TODO.docx
@@ -176,7 +176,7 @@
         <w:rPr>
           <w:color w:val="2E3B47"/>
         </w:rPr>
-        <w:t>Nieuw eCRF 47: Ulcus-vervolgformulier — dekt de COS-eindpunten “wound healing” en “time to healing”, die voordien niet meetbaar waren: het protocol classificeerde een ulcus bij optreden (PEDIS/WIfI) maar had geen mechanisme om te registreren of en wanneer het geneest, en er bestond geen eCRF-document voor de in de protocoltekst genoemde Cardiff Wound Impact Schedule</w:t>
+        <w:t>Nieuw eCRF 47: Ulcus-vervolgformulier — dekt de COS-eindpunten “wound healing” en “time to healing”, die voordien niet meetbaar waren: het protocol classificeerde een ulcus bij optreden (PEDIS/WIfI) maar had geen mechanisme om te registreren of en wanneer het geneest</w:t>
       </w:r>
     </w:p>
     <w:p>
@@ -199,6 +199,17 @@
           <w:color w:val="2E3B47"/>
         </w:rPr>
         <w:t>protocol-analyse.html: nieuw domein “Veiligheid (AE/SAE)” + ontbrekende overzichtsrijen voor eCRF 44/45/45a/45b toegevoegd</w:t>
+      </w:r>
+    </w:p>
+    <w:p>
+      <w:pPr>
+        <w:pStyle w:val="ListBullet"/>
+      </w:pPr>
+      <w:r>
+        <w:rPr>
+          <w:color w:val="2E3B47"/>
+        </w:rPr>
+        <w:t>Teambeslissing (03/08/2026): de Cardiff Wound Impact Schedule wordt niet verder uitgewerkt. eCRF 47 is herleid tot uitsluitend genezingsstatus-tracking; de Cardiff-vermelding in protocol §5.5.6 en in protocol-analyse.html is verwijderd.</w:t>
       </w:r>
     </w:p>
     <w:p>
@@ -2343,51 +2354,7 @@
           <w:color w:val="123A5F"/>
           <w:sz w:val="23"/>
         </w:rPr>
-        <w:t>5.2 Cardiff Wound Impact Schedule — instrument zelf nog toe te voegen</w:t>
-      </w:r>
-    </w:p>
-    <w:p>
-      <w:r>
-        <w:rPr>
-          <w:i w:val="0"/>
-          <w:color w:val="B03A2E"/>
-        </w:rPr>
-        <w:t>eCRF 47 verwijst naar de gevalideerde Nederlandstalige Cardiff Wound Impact Schedule (§5.5.6 protocol), maar bevat — net als bij eCRF 34b/35b (iMCQ/iPCQ) — niet de vragenlijst zelf. De officiële, gevalideerde versie van dit instrument moet nog aangeschaft/gevonden en toegevoegd worden aan de eCRF-set (bv. als 47b).</w:t>
-      </w:r>
-    </w:p>
-    <w:p>
-      <w:pPr>
-        <w:spacing w:before="160"/>
-      </w:pPr>
-      <w:r>
-        <w:rPr>
-          <w:b/>
-          <w:color w:val="123A5F"/>
-          <w:sz w:val="23"/>
-        </w:rPr>
-        <w:t>5.3 Informed consent — Cardiff-vragenlijst niet vermeld bij patiënt</w:t>
-      </w:r>
-    </w:p>
-    <w:p>
-      <w:r>
-        <w:rPr>
-          <w:i w:val="0"/>
-          <w:color w:val="B03A2E"/>
-        </w:rPr>
-        <w:t>Het patiënten-ICF (eCRF 02) vermeldt reeds algemeen dat nieuwe voetklachten gemeld moeten worden, wat de AE/SAE-meldingsplicht (eCRF 46) dekt. Het ICF vermeldt echter nergens dat een deelnemer, bij het optreden van een nieuw ulcus, een bijkomende vragenlijst (Cardiff Wound Impact Schedule, op 4 en 12 weken) zal moeten invullen. Dit is een nieuwe belasting voor de deelnemer die mogelijk in het ICF vermeld moet worden voor volledige informed consent — te beoordelen door u/de EC.</w:t>
-      </w:r>
-    </w:p>
-    <w:p>
-      <w:pPr>
-        <w:spacing w:before="160"/>
-      </w:pPr>
-      <w:r>
-        <w:rPr>
-          <w:b/>
-          <w:color w:val="123A5F"/>
-          <w:sz w:val="23"/>
-        </w:rPr>
-        <w:t>5.4 Geboorteland als proxy voor race/ethnicity</w:t>
+        <w:t>5.2 Geboorteland als proxy voor race/ethnicity (niet dringend)</w:t>
       </w:r>
     </w:p>
     <w:p>
@@ -2396,7 +2363,7 @@
           <w:i w:val="0"/>
           <w:color w:val="59636E"/>
         </w:rPr>
-        <w:t>Deze keuze week bewust af van de letterlijke CDS-aanbeveling omwille van AVG/GDPR. Het kan nuttig zijn om dit expliciet te motiveren in de eventuele methodologiesectie van een toekomstige publicatie, zodat duidelijk is dat dit descriptor overwogen maar bewust aangepast werd (niet over het hoofd gezien).</w:t>
+        <w:t>Bevestigd: geboorteland (eCRF 07, 1.13) blijft de gekozen proxy. Geen actie nu nodig — enkel bij een eventuele publicatie is het nuttig om deze bewuste afwijking van de letterlijke CDS-aanbeveling (omwille van AVG/GDPR) kort te motiveren in de methodesectie.</w:t>
       </w:r>
     </w:p>
     <w:sectPr>

</xml_diff>

<commit_message>
Beslissing herzien: Cardiff Wound Impact Schedule toch volledig uitgewerkt
Team gaat dit item opnieuw bespreken; tot dan volledig uitgewerkt in plaats van
geschrapt (herziening van commit 199ae8f):

- eCRF 47 (Ulcus-vervolgformulier): Cardiff-tracking (afname op 4/12 weken) terug
  toegevoegd naast de genezingsstatus-sectie
- Protocol §5.5.6: zin over de Cardiff Wound Impact Schedule hersteld
- protocol-analyse.html: Cardiff-vermelding in de rij voor eCRF 47 hersteld
- Nieuw eCRF 47b (plaatshouder): duidelijke plek voor het officiële, gevalideerde
  Nederlandstalige instrument zelf, naar het model van eCRF 34b/35b (iMCQ/iPCQ) -
  bevat referentie naar de oorspronkelijke ontwikkelpublicatie (Price & Harding,
  Int Wound J 2004) maar NIET de vragenlijst zelf, om geen inhoud van een
  gevalideerd instrument te verzinnen
- Auditrapport bijgewerkt: TO DO's voor het instrument zelf en de ICF-vermelding
  staan terug open, met notitie dat het team de knoop definitief doorhakt
</commit_message>
<xml_diff>
--- a/(e)CRF/COS-CDS_Auditrapport_en_TODO.docx
+++ b/(e)CRF/COS-CDS_Auditrapport_en_TODO.docx
@@ -176,7 +176,7 @@
         <w:rPr>
           <w:color w:val="2E3B47"/>
         </w:rPr>
-        <w:t>Nieuw eCRF 47: Ulcus-vervolgformulier — dekt de COS-eindpunten “wound healing” en “time to healing”, die voordien niet meetbaar waren: het protocol classificeerde een ulcus bij optreden (PEDIS/WIfI) maar had geen mechanisme om te registreren of en wanneer het geneest</w:t>
+        <w:t>Nieuw eCRF 47: Ulcus-vervolgformulier — dekt de COS-eindpunten “wound healing” en “time to healing”, die voordien niet meetbaar waren: het protocol classificeerde een ulcus bij optreden (PEDIS/WIfI) maar had geen mechanisme om te registreren of en wanneer het geneest, en er bestond geen eCRF-document voor de in de protocoltekst genoemde Cardiff Wound Impact Schedule</w:t>
       </w:r>
     </w:p>
     <w:p>
@@ -209,7 +209,7 @@
         <w:rPr>
           <w:color w:val="2E3B47"/>
         </w:rPr>
-        <w:t>Teambeslissing (03/08/2026): de Cardiff Wound Impact Schedule wordt niet verder uitgewerkt. eCRF 47 is herleid tot uitsluitend genezingsstatus-tracking; de Cardiff-vermelding in protocol §5.5.6 en in protocol-analyse.html is verwijderd.</w:t>
+        <w:t>Beslissing herzien (03/08/2026): de Cardiff Wound Impact Schedule wordt toch volledig uitgewerkt, niet geschrapt. eCRF 47 is terug aangevuld met de Cardiff-tracking, protocol §5.5.6 en protocol-analyse.html zijn hersteld, en een nieuw eCRF 47b (plaatshouder) is toegevoegd voor het officiële instrument zelf, naar het model van eCRF 34b/35b. Het team bespreekt dit item opnieuw voor de definitieve keuze.</w:t>
       </w:r>
     </w:p>
     <w:p>
@@ -2345,6 +2345,46 @@
       </w:r>
     </w:p>
     <w:p>
+      <w:pPr/>
+      <w:r>
+        <w:rPr>
+          <w:b/>
+          <w:color w:val="123A5F"/>
+          <w:sz w:val="23"/>
+        </w:rPr>
+        <w:t>5.2 Cardiff Wound Impact Schedule — instrument zelf nog toe te voegen</w:t>
+      </w:r>
+    </w:p>
+    <w:p>
+      <w:pPr/>
+      <w:r>
+        <w:rPr>
+          <w:color w:val="2E3B47"/>
+        </w:rPr>
+        <w:t>eCRF 47 verwijst naar de gevalideerde Nederlandstalige Cardiff Wound Impact Schedule (§5.5.6 protocol), en eCRF 47b is aangemaakt als plaatshouder daarvoor — net als bij eCRF 34b/35b (iMCQ/iPCQ) bevat dit nog niet de vragenlijst zelf. De officiële, gevalideerde versie van dit instrument moet nog aangeschaft/gevonden en in eCRF 47b geplaatst worden.</w:t>
+      </w:r>
+    </w:p>
+    <w:p>
+      <w:pPr/>
+      <w:r>
+        <w:rPr>
+          <w:b/>
+          <w:color w:val="123A5F"/>
+          <w:sz w:val="23"/>
+        </w:rPr>
+        <w:t>5.3 Informed consent — Cardiff-vragenlijst niet vermeld bij patiënt</w:t>
+      </w:r>
+    </w:p>
+    <w:p>
+      <w:pPr/>
+      <w:r>
+        <w:rPr>
+          <w:color w:val="2E3B47"/>
+        </w:rPr>
+        <w:t>Het patiënten-ICF (eCRF 02) vermeldt reeds algemeen dat nieuwe voetklachten gemeld moeten worden, wat de AE/SAE-meldingsplicht (eCRF 46) dekt. Het ICF vermeldt echter nergens dat een deelnemer, bij het optreden van een nieuw ulcus, een bijkomende vragenlijst (Cardiff Wound Impact Schedule, op 4 en 12 weken) zal moeten invullen. Dit is een nieuwe belasting voor de deelnemer die mogelijk in het ICF vermeld moet worden voor volledige informed consent — te beoordelen door het team/de EC.</w:t>
+      </w:r>
+    </w:p>
+    <w:p>
       <w:pPr>
         <w:spacing w:before="160"/>
       </w:pPr>
@@ -2354,7 +2394,7 @@
           <w:color w:val="123A5F"/>
           <w:sz w:val="23"/>
         </w:rPr>
-        <w:t>5.2 Geboorteland als proxy voor race/ethnicity (niet dringend)</w:t>
+        <w:t>5.4 Geboorteland als proxy voor race/ethnicity (niet dringend)</w:t>
       </w:r>
     </w:p>
     <w:p>

</xml_diff>